<commit_message>
Belgium brief: replace characters that render as boxes in Word
The document contained typographic characters that font substitution can
render as boxes or garbage, which reads as typos: 5 true minus signs
(U+2212) in the trend percentages, plus right arrows, middle dots, a
multiplication sign, and en/em dashes. All replaced with ASCII
equivalents; the document is now ASCII-only apart from the euro sign,
which is universally supported.

Also switches to US spellings (organization, authorized) for a US
audience, removes cosmetic double spaces from section headings, and
glosses "tonnes" as metric tons at first use.

No wording or figures changed.

Co-Authored-By: Claude Opus 5 <noreply@anthropic.com>
Claude-Session: https://claude.ai/code/session_01Gdk2HesEZ22SANvEosojAS
</commit_message>
<xml_diff>
--- a/eu_elv/docs/Belgium_ELV_Material_Value_Brief.docx
+++ b/eu_elv/docs/Belgium_ELV_Material_Value_Brief.docx
@@ -15,7 +15,7 @@
           <w:sz w:val="32"/>
           <w:szCs w:val="32"/>
         </w:rPr>
-        <w:t xml:space="preserve">Belgium's ELV Recycling — What It Tracks and What It's Worth</w:t>
+        <w:t xml:space="preserve">Belgium's ELV Recycling - What It Tracks and What It's Worth</w:t>
       </w:r>
     </w:p>
     <w:p>
@@ -29,7 +29,7 @@
           <w:sz w:val="20"/>
           <w:szCs w:val="20"/>
         </w:rPr>
-        <w:t xml:space="preserve">Research brief · The Global ELV Recycling Gap capstone</w:t>
+        <w:t xml:space="preserve">Research brief | The Global ELV Recycling Gap capstone</w:t>
       </w:r>
     </w:p>
     <w:p>
@@ -43,7 +43,7 @@
           <w:sz w:val="20"/>
           <w:szCs w:val="20"/>
         </w:rPr>
-        <w:t xml:space="preserve">Prepared 1 August 2026 · data year 2023 (latest available)</w:t>
+        <w:t xml:space="preserve">Prepared 1 August 2026 | data year 2023 (latest available)</w:t>
       </w:r>
     </w:p>
     <w:p>
@@ -81,7 +81,7 @@
           <w:sz w:val="40"/>
           <w:szCs w:val="40"/>
         </w:rPr>
-        <w:t xml:space="preserve">€19.7M – €25.8M    ($22.6M – $29.6M)</w:t>
+        <w:t xml:space="preserve">€19.7M - €25.8M   ($22.6M - $29.6M)</w:t>
       </w:r>
     </w:p>
     <w:p>
@@ -99,7 +99,7 @@
           <w:sz w:val="20"/>
           <w:szCs w:val="20"/>
         </w:rPr>
-        <w:t xml:space="preserve">Gross material value Belgium recovers each year from end-of-life vehicles processed at home. Based on 51,840 tonnes recycled domestically in 2023. Quantities are official; the money figure is our calculation.</w:t>
+        <w:t xml:space="preserve">Gross material value Belgium recovers each year from end-of-life vehicles processed at home. Based on 51,840 tonnes (metric tons, 1,000 kg each) recycled domestically in 2023. Quantities are official; the money figure is our calculation.</w:t>
       </w:r>
     </w:p>
     <w:p>
@@ -147,7 +147,7 @@
           <w:sz w:val="22"/>
           <w:szCs w:val="22"/>
         </w:rPr>
-        <w:t xml:space="preserve">Febelauto, a non-profit producer-responsibility organisation, working through 100+ authorised treatment facilities. Flanders' regulator is OVAM; Wallonia and Brussels operate their own regional agreements.</w:t>
+        <w:t xml:space="preserve">Febelauto, a non-profit producer-responsibility organization, working through 100+ authorized treatment facilities. Flanders' regulator is OVAM; Wallonia and Brussels operate their own regional agreements.</w:t>
       </w:r>
     </w:p>
     <w:p>
@@ -175,7 +175,7 @@
           <w:sz w:val="22"/>
           <w:szCs w:val="22"/>
         </w:rPr>
-        <w:t xml:space="preserve">Detailed material tonnages — steel, non-ferrous, tyres, batteries, catalysts, glass, plastics, fluids — submitted to Eurostat every year. This is unusually good disclosure.</w:t>
+        <w:t xml:space="preserve">Detailed material tonnages - steel, non-ferrous, tyres, batteries, catalysts, glass, plastics, fluids - submitted to Eurostat every year. This is unusually good disclosure.</w:t>
       </w:r>
     </w:p>
     <w:p>
@@ -231,7 +231,7 @@
           <w:sz w:val="22"/>
           <w:szCs w:val="22"/>
         </w:rPr>
-        <w:t xml:space="preserve">Steel recovery has fallen 47% since 2018 (63,443 → 33,892 tonnes) while the recycling rate improved. Volumes are shrinking even as compliance looks better.</w:t>
+        <w:t xml:space="preserve">Steel recovery has fallen 47% since 2018 (from 63,443 down to 33,892 tonnes) while the recycling rate improved. Volumes are shrinking even as compliance looks better.</w:t>
       </w:r>
     </w:p>
     <w:p>
@@ -259,7 +259,7 @@
           <w:sz w:val="22"/>
           <w:szCs w:val="22"/>
         </w:rPr>
-        <w:t xml:space="preserve">Costs. Nothing public covers collection, dismantling or shredding costs, so net profit cannot be calculated — only gross material value.</w:t>
+        <w:t xml:space="preserve">Costs. Nothing public covers collection, dismantling or shredding costs, so net profit cannot be calculated - only gross material value.</w:t>
       </w:r>
     </w:p>
     <w:p>
@@ -279,7 +279,7 @@
           <w:sz w:val="26"/>
           <w:szCs w:val="26"/>
         </w:rPr>
-        <w:t xml:space="preserve">A.  Who tracks Belgium's ELVs</w:t>
+        <w:t xml:space="preserve">A. Who tracks Belgium's ELVs</w:t>
       </w:r>
     </w:p>
     <w:tbl>
@@ -353,7 +353,7 @@
                 <w:sz w:val="19"/>
                 <w:szCs w:val="19"/>
               </w:rPr>
-              <w:t xml:space="preserve">Organisation</w:t>
+              <w:t xml:space="preserve">Organization</w:t>
             </w:r>
           </w:p>
         </w:tc>
@@ -406,7 +406,7 @@
                 <w:sz w:val="19"/>
                 <w:szCs w:val="19"/>
               </w:rPr>
-              <w:t xml:space="preserve">Producer-responsibility organisation</w:t>
+              <w:t xml:space="preserve">Producer-responsibility organization</w:t>
             </w:r>
           </w:p>
         </w:tc>
@@ -602,7 +602,7 @@
                 <w:sz w:val="19"/>
                 <w:szCs w:val="19"/>
               </w:rPr>
-              <w:t xml:space="preserve">Named agencies not confirmed — see limitations</w:t>
+              <w:t xml:space="preserve">Named agencies not confirmed - see limitations</w:t>
             </w:r>
           </w:p>
         </w:tc>
@@ -796,7 +796,7 @@
           <w:sz w:val="21"/>
           <w:szCs w:val="21"/>
         </w:rPr>
-        <w:t xml:space="preserve">Febelauto reports ~70,000 vehicles (2024) and ~81,350 (2022). Eurostat reports 63,592 for Belgium (2023). The definitions differ — Febelauto counts vehicles scrapped in Belgium regardless of where they were used. Do not mix the two series in the same chart.</w:t>
+        <w:t xml:space="preserve">Febelauto reports ~70,000 vehicles (2024) and ~81,350 (2022). Eurostat reports 63,592 for Belgium (2023). The definitions differ - Febelauto counts vehicles scrapped in Belgium regardless of where they were used. Do not mix the two series in the same chart.</w:t>
       </w:r>
     </w:p>
     <w:p>
@@ -816,7 +816,7 @@
           <w:sz w:val="26"/>
           <w:szCs w:val="26"/>
         </w:rPr>
-        <w:t xml:space="preserve">B.  Belgium in 2023 — the basics</w:t>
+        <w:t xml:space="preserve">B. Belgium in 2023 - the basics</w:t>
       </w:r>
     </w:p>
     <w:tbl>
@@ -1001,7 +1001,7 @@
                 <w:sz w:val="19"/>
                 <w:szCs w:val="19"/>
               </w:rPr>
-              <w:t xml:space="preserve">—</w:t>
+              <w:t xml:space="preserve">-</w:t>
             </w:r>
           </w:p>
         </w:tc>
@@ -1083,7 +1083,7 @@
                 <w:sz w:val="19"/>
                 <w:szCs w:val="19"/>
               </w:rPr>
-              <w:t xml:space="preserve">—</w:t>
+              <w:t xml:space="preserve">-</w:t>
             </w:r>
           </w:p>
         </w:tc>
@@ -1168,7 +1168,7 @@
                 <w:sz w:val="19"/>
                 <w:szCs w:val="19"/>
               </w:rPr>
-              <w:t xml:space="preserve">85% — met</w:t>
+              <w:t xml:space="preserve">85% - met</w:t>
             </w:r>
           </w:p>
         </w:tc>
@@ -1253,7 +1253,7 @@
                 <w:sz w:val="19"/>
                 <w:szCs w:val="19"/>
               </w:rPr>
-              <w:t xml:space="preserve">95% — met</w:t>
+              <w:t xml:space="preserve">95% - met</w:t>
             </w:r>
           </w:p>
         </w:tc>
@@ -1335,7 +1335,7 @@
                 <w:sz w:val="19"/>
                 <w:szCs w:val="19"/>
               </w:rPr>
-              <w:t xml:space="preserve">—</w:t>
+              <w:t xml:space="preserve">-</w:t>
             </w:r>
           </w:p>
         </w:tc>
@@ -1454,7 +1454,7 @@
           <w:sz w:val="26"/>
           <w:szCs w:val="26"/>
         </w:rPr>
-        <w:t xml:space="preserve">C.  What Belgium actually recovers</w:t>
+        <w:t xml:space="preserve">C. What Belgium actually recovers</w:t>
       </w:r>
     </w:p>
     <w:p>
@@ -2738,7 +2738,7 @@
           <w:sz w:val="19"/>
           <w:szCs w:val="19"/>
         </w:rPr>
-        <w:t xml:space="preserve">Eurostat does not split aluminium from copper — both sit inside the non-ferrous line. Vehicle-level aluminium and copper tonnages are not available from this source.</w:t>
+        <w:t xml:space="preserve">Eurostat does not split aluminium from copper - both sit inside the non-ferrous line. Vehicle-level aluminium and copper tonnages are not available from this source.</w:t>
       </w:r>
     </w:p>
     <w:p>
@@ -3095,7 +3095,7 @@
                 <w:sz w:val="19"/>
                 <w:szCs w:val="19"/>
               </w:rPr>
-              <w:t xml:space="preserve">−47%</w:t>
+              <w:t xml:space="preserve">-47%</w:t>
             </w:r>
           </w:p>
         </w:tc>
@@ -3246,7 +3246,7 @@
                 <w:sz w:val="19"/>
                 <w:szCs w:val="19"/>
               </w:rPr>
-              <w:t xml:space="preserve">−47%</w:t>
+              <w:t xml:space="preserve">-47%</w:t>
             </w:r>
           </w:p>
         </w:tc>
@@ -3397,7 +3397,7 @@
                 <w:sz w:val="19"/>
                 <w:szCs w:val="19"/>
               </w:rPr>
-              <w:t xml:space="preserve">−50%</w:t>
+              <w:t xml:space="preserve">-50%</w:t>
             </w:r>
           </w:p>
         </w:tc>
@@ -3548,7 +3548,7 @@
                 <w:sz w:val="19"/>
                 <w:szCs w:val="19"/>
               </w:rPr>
-              <w:t xml:space="preserve">−61%</w:t>
+              <w:t xml:space="preserve">-61%</w:t>
             </w:r>
           </w:p>
         </w:tc>
@@ -3699,7 +3699,7 @@
                 <w:sz w:val="19"/>
                 <w:szCs w:val="19"/>
               </w:rPr>
-              <w:t xml:space="preserve">−65%</w:t>
+              <w:t xml:space="preserve">-65%</w:t>
             </w:r>
           </w:p>
         </w:tc>
@@ -3752,7 +3752,7 @@
           <w:sz w:val="26"/>
           <w:szCs w:val="26"/>
         </w:rPr>
-        <w:t xml:space="preserve">D.  What it's worth</w:t>
+        <w:t xml:space="preserve">D. What it's worth</w:t>
       </w:r>
     </w:p>
     <w:p>
@@ -3782,7 +3782,7 @@
           <w:sz w:val="21"/>
           <w:szCs w:val="21"/>
         </w:rPr>
-        <w:t xml:space="preserve">Everything below is our calculation: official tonnages × market scrap prices. Do not cite it as a Belgian statistic.</w:t>
+        <w:t xml:space="preserve">Everything below is our calculation: official tonnages x market scrap prices. Do not cite it as a Belgian statistic.</w:t>
       </w:r>
     </w:p>
     <w:tbl>
@@ -3888,7 +3888,7 @@
                 <w:sz w:val="18"/>
                 <w:szCs w:val="18"/>
               </w:rPr>
-              <w:t xml:space="preserve">€/t (low–high)</w:t>
+              <w:t xml:space="preserve">€/t (low-high)</w:t>
             </w:r>
           </w:p>
         </w:tc>
@@ -4054,7 +4054,7 @@
                 <w:sz w:val="18"/>
                 <w:szCs w:val="18"/>
               </w:rPr>
-              <w:t xml:space="preserve">400 – 460</w:t>
+              <w:t xml:space="preserve">400 - 460</w:t>
             </w:r>
           </w:p>
         </w:tc>
@@ -4217,7 +4217,7 @@
                 <w:sz w:val="18"/>
                 <w:szCs w:val="18"/>
               </w:rPr>
-              <w:t xml:space="preserve">400 – 500</w:t>
+              <w:t xml:space="preserve">400 - 500</w:t>
             </w:r>
           </w:p>
         </w:tc>
@@ -4380,7 +4380,7 @@
                 <w:sz w:val="18"/>
                 <w:szCs w:val="18"/>
               </w:rPr>
-              <w:t xml:space="preserve">800 – 1,500</w:t>
+              <w:t xml:space="preserve">800 - 1,500</w:t>
             </w:r>
           </w:p>
         </w:tc>
@@ -4543,7 +4543,7 @@
                 <w:sz w:val="18"/>
                 <w:szCs w:val="18"/>
               </w:rPr>
-              <w:t xml:space="preserve">600 – 800</w:t>
+              <w:t xml:space="preserve">600 - 800</w:t>
             </w:r>
           </w:p>
         </w:tc>
@@ -4706,7 +4706,7 @@
                 <w:sz w:val="18"/>
                 <w:szCs w:val="18"/>
               </w:rPr>
-              <w:t xml:space="preserve">0 – 50</w:t>
+              <w:t xml:space="preserve">0 - 50</w:t>
             </w:r>
           </w:p>
         </w:tc>
@@ -4869,7 +4869,7 @@
                 <w:sz w:val="18"/>
                 <w:szCs w:val="18"/>
               </w:rPr>
-              <w:t xml:space="preserve">0 – 200</w:t>
+              <w:t xml:space="preserve">0 - 200</w:t>
             </w:r>
           </w:p>
         </w:tc>
@@ -5301,7 +5301,7 @@
           <w:sz w:val="23"/>
           <w:szCs w:val="23"/>
         </w:rPr>
-        <w:t xml:space="preserve">€19.7M – €25.8M   →   $22.6M – $29.6M at EUR/USD 1.15 (August 2026).</w:t>
+        <w:t xml:space="preserve">€19.7M - €25.8M  =  $22.6M - $29.6M  (at EUR/USD 1.15, August 2026)</w:t>
       </w:r>
     </w:p>
     <w:p>
@@ -5314,7 +5314,7 @@
           <w:sz w:val="20"/>
           <w:szCs w:val="20"/>
         </w:rPr>
-        <w:t xml:space="preserve">Sanity checks: €310–405 per vehicle, €380–497 per tonne recycled. Both plausible for scrapped passenger cars.</w:t>
+        <w:t xml:space="preserve">Sanity checks: €310-405 per vehicle, €380-497 per tonne recycled. Both plausible for scrapped passenger cars.</w:t>
       </w:r>
     </w:p>
     <w:p>
@@ -5342,7 +5342,7 @@
           <w:sz w:val="22"/>
           <w:szCs w:val="22"/>
         </w:rPr>
-        <w:t xml:space="preserve">It is 60–69% of the total and has the best-sourced prices (E40 shredded France/Belgium ~€460/t; HMS Belgium dock €405–410/t).</w:t>
+        <w:t xml:space="preserve">It is 60-69% of the total and has the best-sourced prices (E40 shredded France/Belgium ~€460/t; HMS Belgium dock €405-410/t).</w:t>
       </w:r>
     </w:p>
     <w:p>
@@ -5370,7 +5370,7 @@
           <w:sz w:val="22"/>
           <w:szCs w:val="22"/>
         </w:rPr>
-        <w:t xml:space="preserve">The €800–1,500/t band is inferred from LME levels, not a sourced Zorba quotation. It alone spans €3.4M of the range.</w:t>
+        <w:t xml:space="preserve">The €800-1,500/t band is inferred from LME levels, not a sourced Zorba quotation. It alone spans €3.4M of the range.</w:t>
       </w:r>
     </w:p>
     <w:p>
@@ -5418,7 +5418,7 @@
           <w:sz w:val="26"/>
           <w:szCs w:val="26"/>
         </w:rPr>
-        <w:t xml:space="preserve">E.  Domestic vs. exported</w:t>
+        <w:t xml:space="preserve">E. Domestic vs. exported</w:t>
       </w:r>
     </w:p>
     <w:p>
@@ -5616,7 +5616,7 @@
                 <w:sz w:val="19"/>
                 <w:szCs w:val="19"/>
               </w:rPr>
-              <w:t xml:space="preserve">Yes — domestic</w:t>
+              <w:t xml:space="preserve">Yes - domestic</w:t>
             </w:r>
           </w:p>
         </w:tc>
@@ -5698,7 +5698,7 @@
                 <w:sz w:val="19"/>
                 <w:szCs w:val="19"/>
               </w:rPr>
-              <w:t xml:space="preserve">Yes — domestic</w:t>
+              <w:t xml:space="preserve">Yes - domestic</w:t>
             </w:r>
           </w:p>
         </w:tc>
@@ -5780,7 +5780,7 @@
                 <w:sz w:val="19"/>
                 <w:szCs w:val="19"/>
               </w:rPr>
-              <w:t xml:space="preserve">No — excluded</w:t>
+              <w:t xml:space="preserve">No - excluded</w:t>
             </w:r>
           </w:p>
         </w:tc>
@@ -5957,7 +5957,7 @@
           <w:sz w:val="26"/>
           <w:szCs w:val="26"/>
         </w:rPr>
-        <w:t xml:space="preserve">F.  What we could not establish</w:t>
+        <w:t xml:space="preserve">F. What we could not establish</w:t>
       </w:r>
     </w:p>
     <w:p>
@@ -5987,7 +5987,7 @@
           <w:sz w:val="22"/>
           <w:szCs w:val="22"/>
         </w:rPr>
-        <w:t xml:space="preserve">No public source covers collection, dismantling, shredding or sorting costs. Net economic benefit cannot be calculated — only gross material value.</w:t>
+        <w:t xml:space="preserve">No public source covers collection, dismantling, shredding or sorting costs. Net economic benefit cannot be calculated - only gross material value.</w:t>
       </w:r>
     </w:p>
     <w:p>
@@ -6175,7 +6175,7 @@
           <w:sz w:val="26"/>
           <w:szCs w:val="26"/>
         </w:rPr>
-        <w:t xml:space="preserve">G.  Executive finding</w:t>
+        <w:t xml:space="preserve">G. Executive finding</w:t>
       </w:r>
     </w:p>
     <w:p>
@@ -6194,7 +6194,7 @@
           <w:sz w:val="21"/>
           <w:szCs w:val="21"/>
         </w:rPr>
-        <w:t xml:space="preserve">Belgium recovers an estimated €19.7–25.8 million ($22.6–29.6 million) of gross material value annually from end-of-life vehicles processed domestically, based on 51,840 tonnes recycled in 2023. This is calculated, not reported: Belgium publishes detailed material tonnages to Eurostat but no monetary valuation, so the quantities are official while the prices are secondary-market bands — with steel alone contributing 60–69% of the total. The figure excludes 4,811 tonnes of exported material and 83 tonnes of catalytic converters that could not be defensibly priced, making it a conservative lower bound. Critically, recovered steel tonnage has fallen 47% since its 2018 peak even as Belgium's recycling rate improved, meaning material value recovered is declining despite improving compliance — a divergence invisible in rate-based reporting. The estimate is gross value at the point of recovery, not net economic benefit, because no public source discloses Belgian treatment costs.</w:t>
+        <w:t xml:space="preserve">Belgium recovers an estimated €19.7-25.8 million ($22.6-29.6 million) of gross material value annually from end-of-life vehicles processed domestically, based on 51,840 tonnes recycled in 2023. This is calculated, not reported: Belgium publishes detailed material tonnages to Eurostat but no monetary valuation, so the quantities are official while the prices are secondary-market bands - with steel alone contributing 60-69% of the total. The figure excludes 4,811 tonnes of exported material and 83 tonnes of catalytic converters that could not be defensibly priced, making it a conservative lower bound. Critically, recovered steel tonnage has fallen 47% since its 2018 peak even as Belgium's recycling rate improved, meaning material value recovered is declining despite improving compliance - a divergence invisible in rate-based reporting. The estimate is gross value at the point of recovery, not net economic benefit, because no public source discloses Belgian treatment costs.</w:t>
       </w:r>
     </w:p>
     <w:p>
@@ -6227,7 +6227,7 @@
           <w:sz w:val="20"/>
           <w:szCs w:val="20"/>
         </w:rPr>
-        <w:t xml:space="preserve">Every tonnage comes from elv_silver.elv_detail filtered to country_code_iso='BE', unit_code='T', operation_code='RCY' — sourced from Eurostat ENV_WASELV via eu_elv/pipeline/fetch_bronze_api.py. Substituting better price data into the Section D table reproduces a revised total directly. The single highest-value next step is obtaining Febelauto's annual reports from an unblocked network.</w:t>
+        <w:t xml:space="preserve">Every tonnage comes from elv_silver.elv_detail filtered to country_code_iso='BE', unit_code='T', operation_code='RCY' - sourced from Eurostat ENV_WASELV via eu_elv/pipeline/fetch_bronze_api.py. Substituting better price data into the Section D table reproduces a revised total directly. The single highest-value next step is obtaining Febelauto's annual reports from an unblocked network.</w:t>
       </w:r>
     </w:p>
     <w:p>
@@ -6258,7 +6258,7 @@
           <w:sz w:val="19"/>
           <w:szCs w:val="19"/>
         </w:rPr>
-        <w:t xml:space="preserve">Febelauto annual report 2024 (not reachable) — </w:t>
+        <w:t xml:space="preserve">Febelauto annual report 2024 (not reachable) - </w:t>
       </w:r>
       <w:r>
         <w:rPr>
@@ -6282,7 +6282,7 @@
           <w:sz w:val="19"/>
           <w:szCs w:val="19"/>
         </w:rPr>
-        <w:t xml:space="preserve">Febelauto figures page (not reachable) — </w:t>
+        <w:t xml:space="preserve">Febelauto figures page (not reachable) - </w:t>
       </w:r>
       <w:r>
         <w:rPr>
@@ -6306,7 +6306,7 @@
           <w:sz w:val="19"/>
           <w:szCs w:val="19"/>
         </w:rPr>
-        <w:t xml:space="preserve">OVAM — vehicles — </w:t>
+        <w:t xml:space="preserve">OVAM - vehicles - </w:t>
       </w:r>
       <w:r>
         <w:rPr>
@@ -6330,7 +6330,7 @@
           <w:sz w:val="19"/>
           <w:szCs w:val="19"/>
         </w:rPr>
-        <w:t xml:space="preserve">EC ELV Directive implementation report 2014–2017 — </w:t>
+        <w:t xml:space="preserve">EC ELV Directive implementation report 2014-2017 - </w:t>
       </w:r>
       <w:r>
         <w:rPr>
@@ -6354,7 +6354,7 @@
           <w:sz w:val="19"/>
           <w:szCs w:val="19"/>
         </w:rPr>
-        <w:t xml:space="preserve">Eurostat ELV dataflows — </w:t>
+        <w:t xml:space="preserve">Eurostat ELV dataflows - </w:t>
       </w:r>
       <w:r>
         <w:rPr>
@@ -6378,7 +6378,7 @@
           <w:sz w:val="19"/>
           <w:szCs w:val="19"/>
         </w:rPr>
-        <w:t xml:space="preserve">Scrap prices — steel — </w:t>
+        <w:t xml:space="preserve">Scrap prices - steel - </w:t>
       </w:r>
       <w:r>
         <w:rPr>
@@ -6402,7 +6402,7 @@
           <w:sz w:val="19"/>
           <w:szCs w:val="19"/>
         </w:rPr>
-        <w:t xml:space="preserve">Scrap prices — lead batteries — </w:t>
+        <w:t xml:space="preserve">Scrap prices - lead batteries - </w:t>
       </w:r>
       <w:r>
         <w:rPr>

</xml_diff>

<commit_message>
Use US spellings across all documents
"tyres" was left as British spelling in the Belgium brief, which reads as
a typo to a US audience. Fixing it surfaced the same issue elsewhere:
"licence" (x7) and "organisation" in the tool comparison, "favourable" in
the talking points, and "labelled" in the data reference.

The Source Data Reference keeps "tyres" in Table 2 deliberately: those 44
instances are Eurostat's own published label text ("End-of-life vehicles:
tyres"), and the point of that document is that it reproduces the source
verbatim. A note now explains this rather than silently editing official
labels.

No figures or wording otherwise changed.

Co-Authored-By: Claude Opus 5 <noreply@anthropic.com>
Claude-Session: https://claude.ai/code/session_01Gdk2HesEZ22SANvEosojAS
</commit_message>
<xml_diff>
--- a/eu_elv/docs/Belgium_ELV_Material_Value_Brief.docx
+++ b/eu_elv/docs/Belgium_ELV_Material_Value_Brief.docx
@@ -175,7 +175,7 @@
           <w:sz w:val="22"/>
           <w:szCs w:val="22"/>
         </w:rPr>
-        <w:t xml:space="preserve">Detailed material tonnages - steel, non-ferrous, tyres, batteries, catalysts, glass, plastics, fluids - submitted to Eurostat every year. This is unusually good disclosure.</w:t>
+        <w:t xml:space="preserve">Detailed material tonnages - steel, non-ferrous, tires, batteries, catalysts, glass, plastics, fluids - submitted to Eurostat every year. This is unusually good disclosure.</w:t>
       </w:r>
     </w:p>
     <w:p>
@@ -1926,7 +1926,7 @@
                 <w:sz w:val="19"/>
                 <w:szCs w:val="19"/>
               </w:rPr>
-              <w:t xml:space="preserve">Tyres</w:t>
+              <w:t xml:space="preserve">Tires</w:t>
             </w:r>
           </w:p>
         </w:tc>
@@ -4652,7 +4652,7 @@
                 <w:sz w:val="18"/>
                 <w:szCs w:val="18"/>
               </w:rPr>
-              <w:t xml:space="preserve">Tyres</w:t>
+              <w:t xml:space="preserve">Tires</w:t>
             </w:r>
           </w:p>
         </w:tc>

</xml_diff>